<commit_message>
feat: add detailed resume variant and a dedicated awards section
build-resume.py gains --detailed (and --all): a full dossier built from the
same resume.json, with no BULLET_CAP, company context lines, all skill groups
listed separately, every project grouped by category with highlights and links,
and every award with its full citation. The default two-page ATS build is
unchanged. Exposed as npm run resume:detailed / resume:all.

Adds five Mindtree recognitions (Unstoppable, A-Team, Master Mind, and the two
2019 value awards) with their citation text, replacing the single "Spot On
Award (x2)" placeholder line.

The website moves awards out of the education block into its own Awards &
accomplishments section, grouped by employer and linked from the nav. Awards
with no date or citation collapse into one "Earlier recognition" group so the
section does not become mostly whitespace.

Co-Authored-By: Claude Opus 5 (1M context) <noreply@anthropic.com>
</commit_message>
<xml_diff>
--- a/resume/Kishore-Prakash-Resume.docx
+++ b/resume/Kishore-Prakash-Resume.docx
@@ -147,7 +147,7 @@
     </w:p>
     <w:p>
       <w:pPr>
-        <w:spacing w:after="20"/>
+        <w:spacing w:before="0" w:after="20"/>
       </w:pPr>
       <w:r>
         <w:rPr>
@@ -161,7 +161,7 @@
     </w:p>
     <w:p>
       <w:pPr>
-        <w:spacing w:after="20"/>
+        <w:spacing w:before="0" w:after="20"/>
       </w:pPr>
       <w:r>
         <w:rPr>
@@ -175,7 +175,7 @@
     </w:p>
     <w:p>
       <w:pPr>
-        <w:spacing w:after="20"/>
+        <w:spacing w:before="0" w:after="20"/>
       </w:pPr>
       <w:r>
         <w:rPr>
@@ -189,7 +189,7 @@
     </w:p>
     <w:p>
       <w:pPr>
-        <w:spacing w:after="20"/>
+        <w:spacing w:before="0" w:after="20"/>
       </w:pPr>
       <w:r>
         <w:rPr>
@@ -203,7 +203,7 @@
     </w:p>
     <w:p>
       <w:pPr>
-        <w:spacing w:after="20"/>
+        <w:spacing w:before="0" w:after="20"/>
       </w:pPr>
       <w:r>
         <w:rPr>
@@ -217,7 +217,7 @@
     </w:p>
     <w:p>
       <w:pPr>
-        <w:spacing w:after="20"/>
+        <w:spacing w:before="0" w:after="20"/>
       </w:pPr>
       <w:r>
         <w:rPr>
@@ -868,7 +868,7 @@
     </w:p>
     <w:p>
       <w:pPr>
-        <w:spacing w:after="20"/>
+        <w:spacing w:before="0" w:after="20"/>
       </w:pPr>
       <w:r>
         <w:rPr>
@@ -882,7 +882,7 @@
     </w:p>
     <w:p>
       <w:pPr>
-        <w:spacing w:after="20"/>
+        <w:spacing w:before="0" w:after="20"/>
       </w:pPr>
       <w:r>
         <w:rPr>
@@ -891,10 +891,13 @@
         <w:t xml:space="preserve">Awards: </w:t>
       </w:r>
       <w:r>
-        <w:t>Going Beyond, CocoaPods to SPM migration (JLL, Jul 2026); Star Award, Intentional Impact (JLL, Jun 2025); Ovations Certificate of Appreciation (JLL, Q4 2024); Ovations JLLT Superstar (JLL, Q1 2024); Spot On Award (x2) (Mindtree); Employee of the Month (Cosmonet Solutions); IBM Hackathon (IBM); Hitachi Programmers Marathon (Hitachi); WeChat Internship Programme (WeChat).</w:t>
+        <w:t>Going Beyond, CocoaPods to SPM migration (JLL, Jul 2026); Star Award, Intentional Impact (JLL, Jun 2025); Ovations Certificate of Appreciation (JLL, Q4 2024); Ovations JLLT Superstar (JLL, Q1 2024); Spot On, Partnership (Mindtree, Feb 2019); Recognition, Accountability (Mindtree, Jan 2019); Master Mind, Expert Thinking (Mindtree, Dec 2018); A-Team, exemplary team spirit (Mindtree, Jan 2018); Unstoppable, execution excellence (Mindtree, Jul 2017); Employee of the Month (Cosmonet Solutions); IBM Hackathon (IBM); Hitachi Programmers Marathon (Hitachi); WeChat Internship Programme (WeChat).</w:t>
       </w:r>
     </w:p>
     <w:p>
+      <w:pPr>
+        <w:spacing w:before="0" w:after="0"/>
+      </w:pPr>
       <w:r>
         <w:rPr>
           <w:b/>
@@ -902,7 +905,7 @@
         <w:t xml:space="preserve">Languages: </w:t>
       </w:r>
       <w:r>
-        <w:t>Kannada — native or bilingual; Telugu — native or bilingual; English — professional working; Hindi — limited working.</w:t>
+        <w:t>Kannada — native or bilingual; Telugu — native or bilingual; English — professional working; Hindi — limited working</w:t>
       </w:r>
     </w:p>
     <w:sectPr>

</xml_diff>